<commit_message>
feat(sensor): add fail-safe boundary check, update docs with signal filtering and adaptive BLE throttling
</commit_message>
<xml_diff>
--- a/docs/BSS_Firmware_Architecture_Report.docx
+++ b/docs/BSS_Firmware_Architecture_Report.docx
@@ -95,7 +95,7 @@
           <w:color w:val="000000"/>
           <w:sz w:val="22"/>
         </w:rPr>
-        <w:t xml:space="preserve">Phiên bản tài liệu: v1.0 - Ngày 28/09/2026  </w:t>
+        <w:t xml:space="preserve">Phiên bản tài liệu: v1.1 - Cập nhật ngày 28/09/2026  </w:t>
       </w:r>
     </w:p>
     <w:p>
@@ -260,24 +260,24 @@
           <w:color w:val="000000"/>
           <w:sz w:val="22"/>
         </w:rPr>
-        <w:t>6. [Xử lý tín hiệu số: Lọc nhiễu (Moving Window) và Chống rung giật (Hysteresis)](#6-xử-lý-tín-hiệu-số-lọc-nhiễu-moving-window-và-chống-rung-giật-hysteresis)</w:t>
-      </w:r>
-    </w:p>
-    <w:p>
-      <w:pPr>
-        <w:rPr>
-          <w:rFonts w:ascii="Times New Roman" w:hAnsi="Times New Roman" w:cs="Times New Roman"/>
-          <w:color w:val="000000"/>
-          <w:sz w:val="22"/>
-        </w:rPr>
-      </w:pPr>
-      <w:r>
-        <w:rPr>
-          <w:rFonts w:ascii="Times New Roman" w:hAnsi="Times New Roman" w:cs="Times New Roman"/>
-          <w:color w:val="000000"/>
-          <w:sz w:val="22"/>
-        </w:rPr>
-        <w:t>7. [Dịch vụ truyền thông không dây Bluetooth Low Energy (BLE)](#7-dịch-vụ-truyền-thông-không-dây-bluetooth-low-energy-ble)</w:t>
+        <w:t>6. [Xử lý tín hiệu số: Lọc nhiễu cửa sổ trượt (Moving Average) &amp; Dải trễ (Hysteresis)](#6-xử-lý-tín-hiệu-số-lọc-nhiễu-cửa-sổ-trượt-moving-average--dải-trễ-hysteresis)</w:t>
+      </w:r>
+    </w:p>
+    <w:p>
+      <w:pPr>
+        <w:rPr>
+          <w:rFonts w:ascii="Times New Roman" w:hAnsi="Times New Roman" w:cs="Times New Roman"/>
+          <w:color w:val="000000"/>
+          <w:sz w:val="22"/>
+        </w:rPr>
+      </w:pPr>
+      <w:r>
+        <w:rPr>
+          <w:rFonts w:ascii="Times New Roman" w:hAnsi="Times New Roman" w:cs="Times New Roman"/>
+          <w:color w:val="000000"/>
+          <w:sz w:val="22"/>
+        </w:rPr>
+        <w:t>7. [Dịch vụ truyền thông không dây BLE &amp; Thuật toán Adaptive Rate Limiting](#7-dịch-vụ-truyền-thông-không-dây-ble--thuật-toán-adaptive-rate-limiting)</w:t>
       </w:r>
     </w:p>
     <w:p>
@@ -357,7 +357,6 @@
           <w:color w:val="000000"/>
           <w:sz w:val="28"/>
         </w:rPr>
-        <w:lastRenderedPageBreak/>
         <w:t>1. Giới thiệu &amp; Đặt vấn đề</w:t>
       </w:r>
     </w:p>
@@ -375,7 +374,58 @@
           <w:color w:val="000000"/>
           <w:sz w:val="22"/>
         </w:rPr>
-        <w:t>Hệ thống cảnh báo điểm mù (Blind Spot Monitoring System - BSS) là một phân hệ an toàn chủ động quan trọng trong các phương tiện giao thông thông minh. Mục tiêu của hệ thống là liên tục quét và phát hiện các phương tiện hoặc chướng ngại vật di chuyển vào khu vực người lái khó quan sát, từ đó đưa ra cảnh báo đa giác quan (thị giác qua đèn LED, xúc giác qua motor rung haptic, và thông tin trạng thái qua giao thức không dây BLE lên màn hình điện thoại).</w:t>
+        <w:t>Hệ thống cảnh báo điểm mù (Blind Spot Monitoring System - BSS) là một phân hệ an toàn chủ động quan trọng trong các phương tiện giao thông thông minh và thiết bị đeo (smart glasses / smart helmets). Mục tiêu của hệ thống là liên tục quét và phát hiện các phương tiện hoặc chướng ngại vật di chuyển vào khu vực người lái khó quan sát, từ đó đưa ra cảnh báo đa giác quan:</w:t>
+      </w:r>
+    </w:p>
+    <w:p>
+      <w:pPr>
+        <w:rPr>
+          <w:rFonts w:ascii="Times New Roman" w:hAnsi="Times New Roman" w:cs="Times New Roman"/>
+          <w:color w:val="000000"/>
+          <w:sz w:val="22"/>
+        </w:rPr>
+      </w:pPr>
+      <w:r>
+        <w:rPr>
+          <w:rFonts w:ascii="Times New Roman" w:hAnsi="Times New Roman" w:cs="Times New Roman"/>
+          <w:color w:val="000000"/>
+          <w:sz w:val="22"/>
+        </w:rPr>
+        <w:t>- Thị giác (Visual): Đèn LED cảnh báo đổi độ sáng theo cự ly.</w:t>
+      </w:r>
+    </w:p>
+    <w:p>
+      <w:pPr>
+        <w:rPr>
+          <w:rFonts w:ascii="Times New Roman" w:hAnsi="Times New Roman" w:cs="Times New Roman"/>
+          <w:color w:val="000000"/>
+          <w:sz w:val="22"/>
+        </w:rPr>
+      </w:pPr>
+      <w:r>
+        <w:rPr>
+          <w:rFonts w:ascii="Times New Roman" w:hAnsi="Times New Roman" w:cs="Times New Roman"/>
+          <w:color w:val="000000"/>
+          <w:sz w:val="22"/>
+        </w:rPr>
+        <w:t>- Xúc giác (Haptic): Motor rung xúc giác biến thiên cường độ theo cấp độ nguy hiểm.</w:t>
+      </w:r>
+    </w:p>
+    <w:p>
+      <w:pPr>
+        <w:rPr>
+          <w:rFonts w:ascii="Times New Roman" w:hAnsi="Times New Roman" w:cs="Times New Roman"/>
+          <w:color w:val="000000"/>
+          <w:sz w:val="22"/>
+        </w:rPr>
+      </w:pPr>
+      <w:r>
+        <w:rPr>
+          <w:rFonts w:ascii="Times New Roman" w:hAnsi="Times New Roman" w:cs="Times New Roman"/>
+          <w:color w:val="000000"/>
+          <w:sz w:val="22"/>
+        </w:rPr>
+        <w:t>- Không dây (Wireless): Truyền trạng thái và dữ liệu cự ly thời gian thực qua Bluetooth Low Energy (BLE) lên smartphone.</w:t>
       </w:r>
     </w:p>
     <w:p>
@@ -1204,7 +1254,6 @@
                 <w:color w:val="000000"/>
                 <w:sz w:val="20"/>
               </w:rPr>
-              <w:lastRenderedPageBreak/>
               <w:t>**3V3 / GND**</w:t>
             </w:r>
           </w:p>
@@ -1760,7 +1809,6 @@
           <w:color w:val="000000"/>
           <w:sz w:val="28"/>
         </w:rPr>
-        <w:lastRenderedPageBreak/>
         <w:t>3. Kiến trúc Firmware Mô-đun hóa (Modular Architecture)</w:t>
       </w:r>
     </w:p>
@@ -1915,24 +1963,24 @@
           <w:color w:val="000000"/>
           <w:sz w:val="19"/>
         </w:rPr>
-        <w:t xml:space="preserve">    ├── sensor_tof.h/.cpp     &lt;-- Tầng trừu tượng cảm biến khoảng cách &amp; phân loại khẩn cấp</w:t>
-      </w:r>
-    </w:p>
-    <w:p>
-      <w:pPr>
-        <w:rPr>
-          <w:rFonts w:ascii="Consolas" w:hAnsi="Consolas" w:cs="Times New Roman"/>
-          <w:color w:val="000000"/>
-          <w:sz w:val="19"/>
-        </w:rPr>
-      </w:pPr>
-      <w:r>
-        <w:rPr>
-          <w:rFonts w:ascii="Consolas" w:hAnsi="Consolas" w:cs="Times New Roman"/>
-          <w:color w:val="000000"/>
-          <w:sz w:val="19"/>
-        </w:rPr>
-        <w:t xml:space="preserve">    ├── feedback_motor.h/.cpp &lt;-- Tầng điều khiển phát xung LEDC cho Motor rung &amp; LED</w:t>
+        <w:t xml:space="preserve">    ├── sensor_tof.h/.cpp     &lt;-- Tầng trừu tượng cảm biến, bộ lọc Moving Average &amp; Hysteresis</w:t>
+      </w:r>
+    </w:p>
+    <w:p>
+      <w:pPr>
+        <w:rPr>
+          <w:rFonts w:ascii="Consolas" w:hAnsi="Consolas" w:cs="Times New Roman"/>
+          <w:color w:val="000000"/>
+          <w:sz w:val="19"/>
+        </w:rPr>
+      </w:pPr>
+      <w:r>
+        <w:rPr>
+          <w:rFonts w:ascii="Consolas" w:hAnsi="Consolas" w:cs="Times New Roman"/>
+          <w:color w:val="000000"/>
+          <w:sz w:val="19"/>
+        </w:rPr>
+        <w:t xml:space="preserve">    ├── feedback_motor.h/.cpp &lt;-- Tầng điều khiển phát xung LEDC cho Motor rung &amp; LED (kèm ledcDetachPin)</w:t>
       </w:r>
     </w:p>
     <w:p>
@@ -1966,7 +2014,7 @@
           <w:color w:val="000000"/>
           <w:sz w:val="19"/>
         </w:rPr>
-        <w:t xml:space="preserve">    └── main.cpp              &lt;-- Bộ điều phối FreeRTOS (Khởi tạo hàng đợi và tạo Task)</w:t>
+        <w:t xml:space="preserve">    └── main.cpp              &lt;-- Bộ điều phối FreeRTOS (Dual-task pipeline &amp; Adaptive BLE rate limit)</w:t>
       </w:r>
     </w:p>
     <w:p>
@@ -2180,7 +2228,6 @@
           <w:color w:val="000000"/>
           <w:sz w:val="22"/>
         </w:rPr>
-        <w:lastRenderedPageBreak/>
         <w:t>- Có sẵn trường object_class để mở rộng cho các mô hình AI/Camera nhận diện đối tượng (người đi bộ, xe con, xe tải).</w:t>
       </w:r>
     </w:p>
@@ -2654,7 +2701,6 @@
           <w:color w:val="000000"/>
           <w:sz w:val="22"/>
         </w:rPr>
-        <w:lastRenderedPageBreak/>
         <w:t>Trong hệ thống cảnh báo va chạm, thông tin quá khứ không mang giá trị cứu sinh. Việc dùng xQueueCreate(1, sizeof(ObstacleEvent_t)) kết hợp xQueueOverwrite() đảm bảo:</w:t>
       </w:r>
     </w:p>
@@ -3669,33 +3715,7 @@
           <w:color w:val="000000"/>
           <w:sz w:val="28"/>
         </w:rPr>
-        <w:t>6. Xử lý tín hiệu số: Lọc nhiễu (Moving Window) và Chống rung giật (Hysteresis)</w:t>
-      </w:r>
-    </w:p>
-    <w:p>
-      <w:pPr>
-        <w:rPr>
-          <w:rFonts w:ascii="Times New Roman" w:hAnsi="Times New Roman" w:cs="Times New Roman"/>
-          <w:color w:val="000000"/>
-          <w:sz w:val="22"/>
-        </w:rPr>
-      </w:pPr>
-    </w:p>
-    <w:p>
-      <w:pPr>
-        <w:rPr>
-          <w:rFonts w:ascii="Times New Roman" w:hAnsi="Times New Roman" w:cs="Times New Roman"/>
-          <w:color w:val="000000"/>
-          <w:sz w:val="22"/>
-        </w:rPr>
-      </w:pPr>
-      <w:r>
-        <w:rPr>
-          <w:rFonts w:ascii="Times New Roman" w:hAnsi="Times New Roman" w:cs="Times New Roman"/>
-          <w:color w:val="000000"/>
-          <w:sz w:val="22"/>
-        </w:rPr>
-        <w:t>Để hoàn thiện firmware khi triển khai thực tế trên phương tiện di chuyển, hai kỹ thuật xử lý tín hiệu số cốt lõi được thiết lập:</w:t>
+        <w:t>6. Xử lý tín hiệu số: Lọc nhiễu cửa sổ trượt (Moving Average) &amp; Dải trễ (Hysteresis)</w:t>
       </w:r>
     </w:p>
     <w:p>
@@ -3721,75 +3741,262 @@
           <w:b/>
           <w:color w:val="000000"/>
         </w:rPr>
-        <w:t>6.1. Bộ lọc cửa sổ trượt: `#define FILTER_WINDOW 5`</w:t>
-      </w:r>
-    </w:p>
-    <w:p>
-      <w:pPr>
-        <w:rPr>
-          <w:rFonts w:ascii="Times New Roman" w:hAnsi="Times New Roman" w:cs="Times New Roman"/>
-          <w:color w:val="000000"/>
-          <w:sz w:val="22"/>
-        </w:rPr>
-      </w:pPr>
-      <w:r>
-        <w:rPr>
-          <w:rFonts w:ascii="Times New Roman" w:hAnsi="Times New Roman" w:cs="Times New Roman"/>
-          <w:color w:val="000000"/>
-          <w:sz w:val="22"/>
-        </w:rPr>
-        <w:t>- Mục đích: Khử nhiễu gai (Spike noise) sinh ra do bụi bẩn, rung lắc cơ học hoặc hiện tượng tán xạ quang học của cảm biến khoảng cách.</w:t>
-      </w:r>
-    </w:p>
-    <w:p>
-      <w:pPr>
-        <w:rPr>
-          <w:rFonts w:ascii="Times New Roman" w:hAnsi="Times New Roman" w:cs="Times New Roman"/>
-          <w:color w:val="000000"/>
-          <w:sz w:val="22"/>
-        </w:rPr>
-      </w:pPr>
-      <w:r>
-        <w:rPr>
-          <w:rFonts w:ascii="Times New Roman" w:hAnsi="Times New Roman" w:cs="Times New Roman"/>
-          <w:color w:val="000000"/>
-          <w:sz w:val="22"/>
-        </w:rPr>
-        <w:t>- Giải thuật: Hệ thống duy trì mảng vòng lưu 5 giá trị đo gần nhất và tính trung bình trượt:</w:t>
-      </w:r>
-    </w:p>
-    <w:p>
-      <w:pPr>
-        <w:rPr>
-          <w:rFonts w:ascii="Times New Roman" w:hAnsi="Times New Roman" w:cs="Times New Roman"/>
-          <w:color w:val="000000"/>
-          <w:sz w:val="22"/>
-        </w:rPr>
-      </w:pPr>
-      <w:r>
-        <w:rPr>
-          <w:rFonts w:ascii="Times New Roman" w:hAnsi="Times New Roman" w:cs="Times New Roman"/>
-          <w:color w:val="000000"/>
-          <w:sz w:val="22"/>
-        </w:rPr>
-        <w:t xml:space="preserve">  $$\bar{d}_k = \frac{1}{5} \sum_{i=0}^{4} d_{k-i}$$</w:t>
-      </w:r>
-    </w:p>
-    <w:p>
-      <w:pPr>
-        <w:rPr>
-          <w:rFonts w:ascii="Times New Roman" w:hAnsi="Times New Roman" w:cs="Times New Roman"/>
-          <w:color w:val="000000"/>
-          <w:sz w:val="22"/>
-        </w:rPr>
-      </w:pPr>
-      <w:r>
-        <w:rPr>
-          <w:rFonts w:ascii="Times New Roman" w:hAnsi="Times New Roman" w:cs="Times New Roman"/>
-          <w:color w:val="000000"/>
-          <w:sz w:val="22"/>
-        </w:rPr>
-        <w:t>- Hiệu quả: Loại bỏ hoàn toàn các báo động giả nhất thời kéo dài dưới 100ms mà không gây trễ đáng kể cho phản xạ an toàn.</w:t>
+        <w:t>6.1. Bộ lọc cửa sổ trượt vòng: `#define FILTER_WINDOW 5`</w:t>
+      </w:r>
+    </w:p>
+    <w:p>
+      <w:pPr>
+        <w:rPr>
+          <w:rFonts w:ascii="Times New Roman" w:hAnsi="Times New Roman" w:cs="Times New Roman"/>
+          <w:color w:val="000000"/>
+          <w:sz w:val="22"/>
+        </w:rPr>
+      </w:pPr>
+      <w:r>
+        <w:rPr>
+          <w:rFonts w:ascii="Times New Roman" w:hAnsi="Times New Roman" w:cs="Times New Roman"/>
+          <w:color w:val="000000"/>
+          <w:sz w:val="22"/>
+        </w:rPr>
+        <w:t>- Mục đích: Khử nhiễu gai (Spike noise) sinh ra do rung lắc cơ học, bụi bẩn hoặc hiện tượng tán xạ quang học của cảm biến khoảng cách.</w:t>
+      </w:r>
+    </w:p>
+    <w:p>
+      <w:pPr>
+        <w:rPr>
+          <w:rFonts w:ascii="Times New Roman" w:hAnsi="Times New Roman" w:cs="Times New Roman"/>
+          <w:color w:val="000000"/>
+          <w:sz w:val="22"/>
+        </w:rPr>
+      </w:pPr>
+      <w:r>
+        <w:rPr>
+          <w:rFonts w:ascii="Times New Roman" w:hAnsi="Times New Roman" w:cs="Times New Roman"/>
+          <w:color w:val="000000"/>
+          <w:sz w:val="22"/>
+        </w:rPr>
+        <w:t>- Giải thuật cài đặt trong src/sensor_tof.cpp:</w:t>
+      </w:r>
+    </w:p>
+    <w:p>
+      <w:pPr>
+        <w:rPr>
+          <w:rFonts w:ascii="Times New Roman" w:hAnsi="Times New Roman" w:cs="Times New Roman"/>
+          <w:color w:val="000000"/>
+          <w:sz w:val="22"/>
+        </w:rPr>
+      </w:pPr>
+      <w:r>
+        <w:rPr>
+          <w:rFonts w:ascii="Times New Roman" w:hAnsi="Times New Roman" w:cs="Times New Roman"/>
+          <w:color w:val="000000"/>
+          <w:sz w:val="22"/>
+        </w:rPr>
+        <w:t xml:space="preserve">  ```cpp</w:t>
+      </w:r>
+    </w:p>
+    <w:p>
+      <w:pPr>
+        <w:rPr>
+          <w:rFonts w:ascii="Times New Roman" w:hAnsi="Times New Roman" w:cs="Times New Roman"/>
+          <w:color w:val="000000"/>
+          <w:sz w:val="22"/>
+        </w:rPr>
+      </w:pPr>
+      <w:r>
+        <w:rPr>
+          <w:rFonts w:ascii="Times New Roman" w:hAnsi="Times New Roman" w:cs="Times New Roman"/>
+          <w:color w:val="000000"/>
+          <w:sz w:val="22"/>
+        </w:rPr>
+        <w:t xml:space="preserve">  static float window[FILTER_WINDOW];</w:t>
+      </w:r>
+    </w:p>
+    <w:p>
+      <w:pPr>
+        <w:rPr>
+          <w:rFonts w:ascii="Times New Roman" w:hAnsi="Times New Roman" w:cs="Times New Roman"/>
+          <w:color w:val="000000"/>
+          <w:sz w:val="22"/>
+        </w:rPr>
+      </w:pPr>
+      <w:r>
+        <w:rPr>
+          <w:rFonts w:ascii="Times New Roman" w:hAnsi="Times New Roman" w:cs="Times New Roman"/>
+          <w:color w:val="000000"/>
+          <w:sz w:val="22"/>
+        </w:rPr>
+        <w:t xml:space="preserve">  static uint8_t win_count = 0, win_idx = 0;</w:t>
+      </w:r>
+    </w:p>
+    <w:p>
+      <w:pPr>
+        <w:rPr>
+          <w:rFonts w:ascii="Times New Roman" w:hAnsi="Times New Roman" w:cs="Times New Roman"/>
+          <w:color w:val="000000"/>
+          <w:sz w:val="22"/>
+        </w:rPr>
+      </w:pPr>
+      <w:r>
+        <w:rPr>
+          <w:rFonts w:ascii="Times New Roman" w:hAnsi="Times New Roman" w:cs="Times New Roman"/>
+          <w:color w:val="000000"/>
+          <w:sz w:val="22"/>
+        </w:rPr>
+        <w:t xml:space="preserve">  static float filter_push(float v) {</w:t>
+      </w:r>
+    </w:p>
+    <w:p>
+      <w:pPr>
+        <w:rPr>
+          <w:rFonts w:ascii="Times New Roman" w:hAnsi="Times New Roman" w:cs="Times New Roman"/>
+          <w:color w:val="000000"/>
+          <w:sz w:val="22"/>
+        </w:rPr>
+      </w:pPr>
+      <w:r>
+        <w:rPr>
+          <w:rFonts w:ascii="Times New Roman" w:hAnsi="Times New Roman" w:cs="Times New Roman"/>
+          <w:color w:val="000000"/>
+          <w:sz w:val="22"/>
+        </w:rPr>
+        <w:t xml:space="preserve">    window[win_idx] = v;</w:t>
+      </w:r>
+    </w:p>
+    <w:p>
+      <w:pPr>
+        <w:rPr>
+          <w:rFonts w:ascii="Times New Roman" w:hAnsi="Times New Roman" w:cs="Times New Roman"/>
+          <w:color w:val="000000"/>
+          <w:sz w:val="22"/>
+        </w:rPr>
+      </w:pPr>
+      <w:r>
+        <w:rPr>
+          <w:rFonts w:ascii="Times New Roman" w:hAnsi="Times New Roman" w:cs="Times New Roman"/>
+          <w:color w:val="000000"/>
+          <w:sz w:val="22"/>
+        </w:rPr>
+        <w:t xml:space="preserve">    win_idx = (win_idx + 1) % FILTER_WINDOW;</w:t>
+      </w:r>
+    </w:p>
+    <w:p>
+      <w:pPr>
+        <w:rPr>
+          <w:rFonts w:ascii="Times New Roman" w:hAnsi="Times New Roman" w:cs="Times New Roman"/>
+          <w:color w:val="000000"/>
+          <w:sz w:val="22"/>
+        </w:rPr>
+      </w:pPr>
+      <w:r>
+        <w:rPr>
+          <w:rFonts w:ascii="Times New Roman" w:hAnsi="Times New Roman" w:cs="Times New Roman"/>
+          <w:color w:val="000000"/>
+          <w:sz w:val="22"/>
+        </w:rPr>
+        <w:t xml:space="preserve">    if (win_count &lt; FILTER_WINDOW) win_count++;</w:t>
+      </w:r>
+    </w:p>
+    <w:p>
+      <w:pPr>
+        <w:rPr>
+          <w:rFonts w:ascii="Times New Roman" w:hAnsi="Times New Roman" w:cs="Times New Roman"/>
+          <w:color w:val="000000"/>
+          <w:sz w:val="22"/>
+        </w:rPr>
+      </w:pPr>
+      <w:r>
+        <w:rPr>
+          <w:rFonts w:ascii="Times New Roman" w:hAnsi="Times New Roman" w:cs="Times New Roman"/>
+          <w:color w:val="000000"/>
+          <w:sz w:val="22"/>
+        </w:rPr>
+        <w:t xml:space="preserve">    float sum = 0;</w:t>
+      </w:r>
+    </w:p>
+    <w:p>
+      <w:pPr>
+        <w:rPr>
+          <w:rFonts w:ascii="Times New Roman" w:hAnsi="Times New Roman" w:cs="Times New Roman"/>
+          <w:color w:val="000000"/>
+          <w:sz w:val="22"/>
+        </w:rPr>
+      </w:pPr>
+      <w:r>
+        <w:rPr>
+          <w:rFonts w:ascii="Times New Roman" w:hAnsi="Times New Roman" w:cs="Times New Roman"/>
+          <w:color w:val="000000"/>
+          <w:sz w:val="22"/>
+        </w:rPr>
+        <w:t xml:space="preserve">    for (uint8_t i = 0; i &lt; win_count; i++) sum += window[i];</w:t>
+      </w:r>
+    </w:p>
+    <w:p>
+      <w:pPr>
+        <w:rPr>
+          <w:rFonts w:ascii="Times New Roman" w:hAnsi="Times New Roman" w:cs="Times New Roman"/>
+          <w:color w:val="000000"/>
+          <w:sz w:val="22"/>
+        </w:rPr>
+      </w:pPr>
+      <w:r>
+        <w:rPr>
+          <w:rFonts w:ascii="Times New Roman" w:hAnsi="Times New Roman" w:cs="Times New Roman"/>
+          <w:color w:val="000000"/>
+          <w:sz w:val="22"/>
+        </w:rPr>
+        <w:t xml:space="preserve">    return sum / win_count;</w:t>
+      </w:r>
+    </w:p>
+    <w:p>
+      <w:pPr>
+        <w:rPr>
+          <w:rFonts w:ascii="Times New Roman" w:hAnsi="Times New Roman" w:cs="Times New Roman"/>
+          <w:color w:val="000000"/>
+          <w:sz w:val="22"/>
+        </w:rPr>
+      </w:pPr>
+      <w:r>
+        <w:rPr>
+          <w:rFonts w:ascii="Times New Roman" w:hAnsi="Times New Roman" w:cs="Times New Roman"/>
+          <w:color w:val="000000"/>
+          <w:sz w:val="22"/>
+        </w:rPr>
+        <w:t xml:space="preserve">  }</w:t>
+      </w:r>
+    </w:p>
+    <w:p>
+      <w:pPr>
+        <w:rPr>
+          <w:rFonts w:ascii="Times New Roman" w:hAnsi="Times New Roman" w:cs="Times New Roman"/>
+          <w:color w:val="000000"/>
+          <w:sz w:val="22"/>
+        </w:rPr>
+      </w:pPr>
+      <w:r>
+        <w:rPr>
+          <w:rFonts w:ascii="Times New Roman" w:hAnsi="Times New Roman" w:cs="Times New Roman"/>
+          <w:color w:val="000000"/>
+          <w:sz w:val="22"/>
+        </w:rPr>
+        <w:t xml:space="preserve">  ```</w:t>
+      </w:r>
+    </w:p>
+    <w:p>
+      <w:pPr>
+        <w:rPr>
+          <w:rFonts w:ascii="Times New Roman" w:hAnsi="Times New Roman" w:cs="Times New Roman"/>
+          <w:color w:val="000000"/>
+          <w:sz w:val="22"/>
+        </w:rPr>
+      </w:pPr>
+      <w:r>
+        <w:rPr>
+          <w:rFonts w:ascii="Times New Roman" w:hAnsi="Times New Roman" w:cs="Times New Roman"/>
+          <w:color w:val="000000"/>
+          <w:sz w:val="22"/>
+        </w:rPr>
+        <w:t>- Điểm ưu việt: Quản lý biến win_count động, đảm bảo trong 4 chu kỳ đầu tiên khi hệ thống mới khởi động, giá trị trung bình chia đúng cho số mẫu hiện có mà không bị đo sai.</w:t>
       </w:r>
     </w:p>
     <w:p>
@@ -3815,92 +4022,348 @@
           <w:b/>
           <w:color w:val="000000"/>
         </w:rPr>
-        <w:t>6.2. Vùng trễ chuyển trạng thái: `#define HYSTERESIS_CM 10`</w:t>
-      </w:r>
-    </w:p>
-    <w:p>
-      <w:pPr>
-        <w:rPr>
-          <w:rFonts w:ascii="Times New Roman" w:hAnsi="Times New Roman" w:cs="Times New Roman"/>
-          <w:color w:val="000000"/>
-          <w:sz w:val="22"/>
-        </w:rPr>
-      </w:pPr>
-      <w:r>
-        <w:rPr>
-          <w:rFonts w:ascii="Times New Roman" w:hAnsi="Times New Roman" w:cs="Times New Roman"/>
-          <w:color w:val="000000"/>
-          <w:sz w:val="22"/>
-        </w:rPr>
-        <w:t>- Mục đích: Triệt tiêu hiện tượng nhấp nháy chuyển trạng thái liên tục (Chattering) khi vật thể di chuyển mấp mé ngay tại ranh giới các ngưỡng cảnh báo (ví dụ dao động quanh mức 100cm).</w:t>
-      </w:r>
-    </w:p>
-    <w:p>
-      <w:pPr>
-        <w:rPr>
-          <w:rFonts w:ascii="Times New Roman" w:hAnsi="Times New Roman" w:cs="Times New Roman"/>
-          <w:color w:val="000000"/>
-          <w:sz w:val="22"/>
-        </w:rPr>
-      </w:pPr>
-      <w:r>
-        <w:rPr>
-          <w:rFonts w:ascii="Times New Roman" w:hAnsi="Times New Roman" w:cs="Times New Roman"/>
-          <w:color w:val="000000"/>
-          <w:sz w:val="22"/>
-        </w:rPr>
-        <w:t>- Nguyên lý Schmitt Trigger:</w:t>
-      </w:r>
-    </w:p>
-    <w:p>
-      <w:pPr>
-        <w:rPr>
-          <w:rFonts w:ascii="Times New Roman" w:hAnsi="Times New Roman" w:cs="Times New Roman"/>
-          <w:color w:val="000000"/>
-          <w:sz w:val="22"/>
-        </w:rPr>
-      </w:pPr>
-      <w:r>
-        <w:rPr>
-          <w:rFonts w:ascii="Times New Roman" w:hAnsi="Times New Roman" w:cs="Times New Roman"/>
-          <w:color w:val="000000"/>
-          <w:sz w:val="22"/>
-        </w:rPr>
-        <w:t xml:space="preserve">  - Để bật cảnh báo mức cao hơn: Khoảng cách phải giảm sâu xuống dưới ngưỡng $T$ ($d &lt; T$).</w:t>
-      </w:r>
-    </w:p>
-    <w:p>
-      <w:pPr>
-        <w:rPr>
-          <w:rFonts w:ascii="Times New Roman" w:hAnsi="Times New Roman" w:cs="Times New Roman"/>
-          <w:color w:val="000000"/>
-          <w:sz w:val="22"/>
-        </w:rPr>
-      </w:pPr>
-      <w:r>
-        <w:rPr>
-          <w:rFonts w:ascii="Times New Roman" w:hAnsi="Times New Roman" w:cs="Times New Roman"/>
-          <w:color w:val="000000"/>
-          <w:sz w:val="22"/>
-        </w:rPr>
-        <w:t xml:space="preserve">  - Để tắt hoặc hạ mức cảnh báo: Khoảng cách phải tăng vượt qua ngưỡng $T$ cộng thêm độ trễ ($d &gt; T + \Delta H$).</w:t>
-      </w:r>
-    </w:p>
-    <w:p>
-      <w:pPr>
-        <w:rPr>
-          <w:rFonts w:ascii="Times New Roman" w:hAnsi="Times New Roman" w:cs="Times New Roman"/>
-          <w:color w:val="000000"/>
-          <w:sz w:val="22"/>
-        </w:rPr>
-      </w:pPr>
-      <w:r>
-        <w:rPr>
-          <w:rFonts w:ascii="Times New Roman" w:hAnsi="Times New Roman" w:cs="Times New Roman"/>
-          <w:color w:val="000000"/>
-          <w:sz w:val="22"/>
-        </w:rPr>
-        <w:t xml:space="preserve">  - Với $\Delta H = 10\text{ cm}$, nếu xe chạy ở cự ly 100cm, hệ thống chỉ kích hoạt khi $d &lt; 100\text{ cm}$ và chỉ ngắt khi xe phía sau đã lùi xa hơn $110\text{ cm}$.</w:t>
+        <w:t>6.2. Thuật toán dải trễ bất đối xứng (Asymmetric Hysteresis State Machine): `#define HYSTERESIS_CM 10`</w:t>
+      </w:r>
+    </w:p>
+    <w:p>
+      <w:pPr>
+        <w:rPr>
+          <w:rFonts w:ascii="Times New Roman" w:hAnsi="Times New Roman" w:cs="Times New Roman"/>
+          <w:color w:val="000000"/>
+          <w:sz w:val="22"/>
+        </w:rPr>
+      </w:pPr>
+      <w:r>
+        <w:rPr>
+          <w:rFonts w:ascii="Times New Roman" w:hAnsi="Times New Roman" w:cs="Times New Roman"/>
+          <w:color w:val="000000"/>
+          <w:sz w:val="22"/>
+        </w:rPr>
+        <w:t>- Mục đích: Triệt tiêu hoàn toàn hiện tượng nhấp nháy chuyển trạng thái liên tục (Chattering) khi vật thể di chuyển mấp mé ngay tại ranh giới các ngưỡng cảnh báo (ví dụ dao động quanh mức 100cm).</w:t>
+      </w:r>
+    </w:p>
+    <w:p>
+      <w:pPr>
+        <w:rPr>
+          <w:rFonts w:ascii="Times New Roman" w:hAnsi="Times New Roman" w:cs="Times New Roman"/>
+          <w:color w:val="000000"/>
+          <w:sz w:val="22"/>
+        </w:rPr>
+      </w:pPr>
+      <w:r>
+        <w:rPr>
+          <w:rFonts w:ascii="Times New Roman" w:hAnsi="Times New Roman" w:cs="Times New Roman"/>
+          <w:color w:val="000000"/>
+          <w:sz w:val="22"/>
+        </w:rPr>
+        <w:t>- Cơ chế hoạt động:</w:t>
+      </w:r>
+    </w:p>
+    <w:p>
+      <w:pPr>
+        <w:rPr>
+          <w:rFonts w:ascii="Times New Roman" w:hAnsi="Times New Roman" w:cs="Times New Roman"/>
+          <w:color w:val="000000"/>
+          <w:sz w:val="22"/>
+        </w:rPr>
+      </w:pPr>
+      <w:r>
+        <w:rPr>
+          <w:rFonts w:ascii="Times New Roman" w:hAnsi="Times New Roman" w:cs="Times New Roman"/>
+          <w:color w:val="000000"/>
+          <w:sz w:val="22"/>
+        </w:rPr>
+        <w:t xml:space="preserve">  ```cpp</w:t>
+      </w:r>
+    </w:p>
+    <w:p>
+      <w:pPr>
+        <w:rPr>
+          <w:rFonts w:ascii="Times New Roman" w:hAnsi="Times New Roman" w:cs="Times New Roman"/>
+          <w:color w:val="000000"/>
+          <w:sz w:val="22"/>
+        </w:rPr>
+      </w:pPr>
+      <w:r>
+        <w:rPr>
+          <w:rFonts w:ascii="Times New Roman" w:hAnsi="Times New Roman" w:cs="Times New Roman"/>
+          <w:color w:val="000000"/>
+          <w:sz w:val="22"/>
+        </w:rPr>
+        <w:t xml:space="preserve">  static const float LEAVE_CM[4] = {0, THRESHOLD_CHU_Y_CM, THRESHOLD_GAN_CM, THRESHOLD_KHAN_CAP_CM};</w:t>
+      </w:r>
+    </w:p>
+    <w:p>
+      <w:pPr>
+        <w:rPr>
+          <w:rFonts w:ascii="Times New Roman" w:hAnsi="Times New Roman" w:cs="Times New Roman"/>
+          <w:color w:val="000000"/>
+          <w:sz w:val="22"/>
+        </w:rPr>
+      </w:pPr>
+      <w:r>
+        <w:rPr>
+          <w:rFonts w:ascii="Times New Roman" w:hAnsi="Times New Roman" w:cs="Times New Roman"/>
+          <w:color w:val="000000"/>
+          <w:sz w:val="22"/>
+        </w:rPr>
+        <w:t xml:space="preserve">  static uint8_t level = 0;</w:t>
+      </w:r>
+    </w:p>
+    <w:p>
+      <w:pPr>
+        <w:rPr>
+          <w:rFonts w:ascii="Times New Roman" w:hAnsi="Times New Roman" w:cs="Times New Roman"/>
+          <w:color w:val="000000"/>
+          <w:sz w:val="22"/>
+        </w:rPr>
+      </w:pPr>
+    </w:p>
+    <w:p>
+      <w:pPr>
+        <w:rPr>
+          <w:rFonts w:ascii="Times New Roman" w:hAnsi="Times New Roman" w:cs="Times New Roman"/>
+          <w:color w:val="000000"/>
+          <w:sz w:val="22"/>
+        </w:rPr>
+      </w:pPr>
+      <w:r>
+        <w:rPr>
+          <w:rFonts w:ascii="Times New Roman" w:hAnsi="Times New Roman" w:cs="Times New Roman"/>
+          <w:color w:val="000000"/>
+          <w:sz w:val="22"/>
+        </w:rPr>
+        <w:t xml:space="preserve">  uint8_t raw;</w:t>
+      </w:r>
+    </w:p>
+    <w:p>
+      <w:pPr>
+        <w:rPr>
+          <w:rFonts w:ascii="Times New Roman" w:hAnsi="Times New Roman" w:cs="Times New Roman"/>
+          <w:color w:val="000000"/>
+          <w:sz w:val="22"/>
+        </w:rPr>
+      </w:pPr>
+      <w:r>
+        <w:rPr>
+          <w:rFonts w:ascii="Times New Roman" w:hAnsi="Times New Roman" w:cs="Times New Roman"/>
+          <w:color w:val="000000"/>
+          <w:sz w:val="22"/>
+        </w:rPr>
+        <w:t xml:space="preserve">  if (d &lt;= 0.0f || d &gt; THRESHOLD_CHU_Y_CM) raw = 0;</w:t>
+      </w:r>
+    </w:p>
+    <w:p>
+      <w:pPr>
+        <w:rPr>
+          <w:rFonts w:ascii="Times New Roman" w:hAnsi="Times New Roman" w:cs="Times New Roman"/>
+          <w:color w:val="000000"/>
+          <w:sz w:val="22"/>
+        </w:rPr>
+      </w:pPr>
+      <w:r>
+        <w:rPr>
+          <w:rFonts w:ascii="Times New Roman" w:hAnsi="Times New Roman" w:cs="Times New Roman"/>
+          <w:color w:val="000000"/>
+          <w:sz w:val="22"/>
+        </w:rPr>
+        <w:t xml:space="preserve">  else if (d &gt; THRESHOLD_GAN_CM)           raw = 1;</w:t>
+      </w:r>
+    </w:p>
+    <w:p>
+      <w:pPr>
+        <w:rPr>
+          <w:rFonts w:ascii="Times New Roman" w:hAnsi="Times New Roman" w:cs="Times New Roman"/>
+          <w:color w:val="000000"/>
+          <w:sz w:val="22"/>
+        </w:rPr>
+      </w:pPr>
+      <w:r>
+        <w:rPr>
+          <w:rFonts w:ascii="Times New Roman" w:hAnsi="Times New Roman" w:cs="Times New Roman"/>
+          <w:color w:val="000000"/>
+          <w:sz w:val="22"/>
+        </w:rPr>
+        <w:t xml:space="preserve">  else if (d &gt; THRESHOLD_KHAN_CAP_CM)      raw = 2;</w:t>
+      </w:r>
+    </w:p>
+    <w:p>
+      <w:pPr>
+        <w:rPr>
+          <w:rFonts w:ascii="Times New Roman" w:hAnsi="Times New Roman" w:cs="Times New Roman"/>
+          <w:color w:val="000000"/>
+          <w:sz w:val="22"/>
+        </w:rPr>
+      </w:pPr>
+      <w:r>
+        <w:rPr>
+          <w:rFonts w:ascii="Times New Roman" w:hAnsi="Times New Roman" w:cs="Times New Roman"/>
+          <w:color w:val="000000"/>
+          <w:sz w:val="22"/>
+        </w:rPr>
+        <w:t xml:space="preserve">  else                                     raw = 3;</w:t>
+      </w:r>
+    </w:p>
+    <w:p>
+      <w:pPr>
+        <w:rPr>
+          <w:rFonts w:ascii="Times New Roman" w:hAnsi="Times New Roman" w:cs="Times New Roman"/>
+          <w:color w:val="000000"/>
+          <w:sz w:val="22"/>
+        </w:rPr>
+      </w:pPr>
+    </w:p>
+    <w:p>
+      <w:pPr>
+        <w:rPr>
+          <w:rFonts w:ascii="Times New Roman" w:hAnsi="Times New Roman" w:cs="Times New Roman"/>
+          <w:color w:val="000000"/>
+          <w:sz w:val="22"/>
+        </w:rPr>
+      </w:pPr>
+      <w:r>
+        <w:rPr>
+          <w:rFonts w:ascii="Times New Roman" w:hAnsi="Times New Roman" w:cs="Times New Roman"/>
+          <w:color w:val="000000"/>
+          <w:sz w:val="22"/>
+        </w:rPr>
+        <w:t xml:space="preserve">  if (raw &gt; level) {</w:t>
+      </w:r>
+    </w:p>
+    <w:p>
+      <w:pPr>
+        <w:rPr>
+          <w:rFonts w:ascii="Times New Roman" w:hAnsi="Times New Roman" w:cs="Times New Roman"/>
+          <w:color w:val="000000"/>
+          <w:sz w:val="22"/>
+        </w:rPr>
+      </w:pPr>
+      <w:r>
+        <w:rPr>
+          <w:rFonts w:ascii="Times New Roman" w:hAnsi="Times New Roman" w:cs="Times New Roman"/>
+          <w:color w:val="000000"/>
+          <w:sz w:val="22"/>
+        </w:rPr>
+        <w:t xml:space="preserve">    level = raw; // Nguy hiểm hơn: phản xạ báo ngay lập tức!</w:t>
+      </w:r>
+    </w:p>
+    <w:p>
+      <w:pPr>
+        <w:rPr>
+          <w:rFonts w:ascii="Times New Roman" w:hAnsi="Times New Roman" w:cs="Times New Roman"/>
+          <w:color w:val="000000"/>
+          <w:sz w:val="22"/>
+        </w:rPr>
+      </w:pPr>
+      <w:r>
+        <w:rPr>
+          <w:rFonts w:ascii="Times New Roman" w:hAnsi="Times New Roman" w:cs="Times New Roman"/>
+          <w:color w:val="000000"/>
+          <w:sz w:val="22"/>
+        </w:rPr>
+        <w:t xml:space="preserve">  } else if (raw &lt; level &amp;&amp; d &gt; LEAVE_CM[level] + HYSTERESIS_CM) {</w:t>
+      </w:r>
+    </w:p>
+    <w:p>
+      <w:pPr>
+        <w:rPr>
+          <w:rFonts w:ascii="Times New Roman" w:hAnsi="Times New Roman" w:cs="Times New Roman"/>
+          <w:color w:val="000000"/>
+          <w:sz w:val="22"/>
+        </w:rPr>
+      </w:pPr>
+      <w:r>
+        <w:rPr>
+          <w:rFonts w:ascii="Times New Roman" w:hAnsi="Times New Roman" w:cs="Times New Roman"/>
+          <w:color w:val="000000"/>
+          <w:sz w:val="22"/>
+        </w:rPr>
+        <w:t xml:space="preserve">    level = raw; // An toàn hơn: phải vượt mốc + 10cm mới hạ cấp cảnh báo!</w:t>
+      </w:r>
+    </w:p>
+    <w:p>
+      <w:pPr>
+        <w:rPr>
+          <w:rFonts w:ascii="Times New Roman" w:hAnsi="Times New Roman" w:cs="Times New Roman"/>
+          <w:color w:val="000000"/>
+          <w:sz w:val="22"/>
+        </w:rPr>
+      </w:pPr>
+      <w:r>
+        <w:rPr>
+          <w:rFonts w:ascii="Times New Roman" w:hAnsi="Times New Roman" w:cs="Times New Roman"/>
+          <w:color w:val="000000"/>
+          <w:sz w:val="22"/>
+        </w:rPr>
+        <w:t xml:space="preserve">  }</w:t>
+      </w:r>
+    </w:p>
+    <w:p>
+      <w:pPr>
+        <w:rPr>
+          <w:rFonts w:ascii="Times New Roman" w:hAnsi="Times New Roman" w:cs="Times New Roman"/>
+          <w:color w:val="000000"/>
+          <w:sz w:val="22"/>
+        </w:rPr>
+      </w:pPr>
+      <w:r>
+        <w:rPr>
+          <w:rFonts w:ascii="Times New Roman" w:hAnsi="Times New Roman" w:cs="Times New Roman"/>
+          <w:color w:val="000000"/>
+          <w:sz w:val="22"/>
+        </w:rPr>
+        <w:t xml:space="preserve">  ```</w:t>
+      </w:r>
+    </w:p>
+    <w:p>
+      <w:pPr>
+        <w:rPr>
+          <w:rFonts w:ascii="Times New Roman" w:hAnsi="Times New Roman" w:cs="Times New Roman"/>
+          <w:color w:val="000000"/>
+          <w:sz w:val="22"/>
+        </w:rPr>
+      </w:pPr>
+      <w:r>
+        <w:rPr>
+          <w:rFonts w:ascii="Times New Roman" w:hAnsi="Times New Roman" w:cs="Times New Roman"/>
+          <w:color w:val="000000"/>
+          <w:sz w:val="22"/>
+        </w:rPr>
+        <w:t>- Triết lý an toàn:</w:t>
+      </w:r>
+    </w:p>
+    <w:p>
+      <w:pPr>
+        <w:rPr>
+          <w:rFonts w:ascii="Times New Roman" w:hAnsi="Times New Roman" w:cs="Times New Roman"/>
+          <w:color w:val="000000"/>
+          <w:sz w:val="22"/>
+        </w:rPr>
+      </w:pPr>
+      <w:r>
+        <w:rPr>
+          <w:rFonts w:ascii="Times New Roman" w:hAnsi="Times New Roman" w:cs="Times New Roman"/>
+          <w:color w:val="000000"/>
+          <w:sz w:val="22"/>
+        </w:rPr>
+        <w:t xml:space="preserve">  - Khi nguy cơ tăng lên (raw &gt; level): Chuyển cấp tức thì để bảo vệ người lái.</w:t>
+      </w:r>
+    </w:p>
+    <w:p>
+      <w:pPr>
+        <w:rPr>
+          <w:rFonts w:ascii="Times New Roman" w:hAnsi="Times New Roman" w:cs="Times New Roman"/>
+          <w:color w:val="000000"/>
+          <w:sz w:val="22"/>
+        </w:rPr>
+      </w:pPr>
+      <w:r>
+        <w:rPr>
+          <w:rFonts w:ascii="Times New Roman" w:hAnsi="Times New Roman" w:cs="Times New Roman"/>
+          <w:color w:val="000000"/>
+          <w:sz w:val="22"/>
+        </w:rPr>
+        <w:t xml:space="preserve">  - Khi nguy cơ giảm đi (raw &lt; level): Yêu cầu cự ly phải dãn ra thêm ít nhất 10 cm (HYSTERESIS_CM) mới cho phép hạ cấp, giúp cảm giác rung haptic cực kỳ đầm và ổn định.</w:t>
       </w:r>
     </w:p>
     <w:p>
@@ -3946,7 +4409,7 @@
           <w:color w:val="000000"/>
           <w:sz w:val="28"/>
         </w:rPr>
-        <w:t>7. Dịch vụ truyền thông không dây Bluetooth Low Energy (BLE)</w:t>
+        <w:t>7. Dịch vụ truyền thông không dây BLE &amp; Thuật toán Adaptive Rate Limiting</w:t>
       </w:r>
     </w:p>
     <w:p>
@@ -4006,7 +4469,6 @@
           <w:color w:val="000000"/>
           <w:sz w:val="22"/>
         </w:rPr>
-        <w:lastRenderedPageBreak/>
         <w:t>- Device Name: SmartGlasses-OB</w:t>
       </w:r>
     </w:p>
@@ -4084,102 +4546,213 @@
           <w:b/>
           <w:color w:val="000000"/>
         </w:rPr>
-        <w:t>7.2. Định dạng khung truyền dữ liệu (Telemetry Payload)</w:t>
-      </w:r>
-    </w:p>
-    <w:p>
-      <w:pPr>
-        <w:rPr>
-          <w:rFonts w:ascii="Times New Roman" w:hAnsi="Times New Roman" w:cs="Times New Roman"/>
-          <w:color w:val="000000"/>
-          <w:sz w:val="22"/>
-        </w:rPr>
-      </w:pPr>
-      <w:r>
-        <w:rPr>
-          <w:rFonts w:ascii="Times New Roman" w:hAnsi="Times New Roman" w:cs="Times New Roman"/>
-          <w:color w:val="000000"/>
-          <w:sz w:val="22"/>
-        </w:rPr>
-        <w:t>Dữ liệu gửi lên ứng dụng di động được serialize thành mảng 4 bytes cô đọng:</w:t>
-      </w:r>
-    </w:p>
-    <w:p>
-      <w:pPr>
-        <w:rPr>
-          <w:rFonts w:ascii="Consolas" w:hAnsi="Consolas" w:cs="Times New Roman"/>
-          <w:color w:val="000000"/>
-          <w:sz w:val="19"/>
-        </w:rPr>
-      </w:pPr>
-      <w:r>
-        <w:rPr>
-          <w:rFonts w:ascii="Consolas" w:hAnsi="Consolas" w:cs="Times New Roman"/>
-          <w:color w:val="000000"/>
-          <w:sz w:val="19"/>
-        </w:rPr>
-        <w:t>Byte 0: distance_mm &amp; 0xFF        (Byte thấp của khoảng cách)</w:t>
-      </w:r>
-    </w:p>
-    <w:p>
-      <w:pPr>
-        <w:rPr>
-          <w:rFonts w:ascii="Consolas" w:hAnsi="Consolas" w:cs="Times New Roman"/>
-          <w:color w:val="000000"/>
-          <w:sz w:val="19"/>
-        </w:rPr>
-      </w:pPr>
-      <w:r>
-        <w:rPr>
-          <w:rFonts w:ascii="Consolas" w:hAnsi="Consolas" w:cs="Times New Roman"/>
-          <w:color w:val="000000"/>
-          <w:sz w:val="19"/>
-        </w:rPr>
-        <w:t>Byte 1: (distance_mm &gt;&gt; 8) &amp; 0xFF (Byte cao của khoảng cách)</w:t>
-      </w:r>
-    </w:p>
-    <w:p>
-      <w:pPr>
-        <w:rPr>
-          <w:rFonts w:ascii="Consolas" w:hAnsi="Consolas" w:cs="Times New Roman"/>
-          <w:color w:val="000000"/>
-          <w:sz w:val="19"/>
-        </w:rPr>
-      </w:pPr>
-      <w:r>
-        <w:rPr>
-          <w:rFonts w:ascii="Consolas" w:hAnsi="Consolas" w:cs="Times New Roman"/>
-          <w:color w:val="000000"/>
-          <w:sz w:val="19"/>
-        </w:rPr>
-        <w:t>Byte 2: urgency_level             (Cấp độ khẩn cấp: 0 - 3)</w:t>
-      </w:r>
-    </w:p>
-    <w:p>
-      <w:pPr>
-        <w:rPr>
-          <w:rFonts w:ascii="Consolas" w:hAnsi="Consolas" w:cs="Times New Roman"/>
-          <w:color w:val="000000"/>
-          <w:sz w:val="19"/>
-        </w:rPr>
-      </w:pPr>
-      <w:r>
-        <w:rPr>
-          <w:rFonts w:ascii="Consolas" w:hAnsi="Consolas" w:cs="Times New Roman"/>
-          <w:color w:val="000000"/>
-          <w:sz w:val="19"/>
-        </w:rPr>
-        <w:t>Byte 3: object_class              (Định danh loại đối tượng)</w:t>
-      </w:r>
-    </w:p>
-    <w:p>
-      <w:pPr>
-        <w:rPr>
-          <w:rFonts w:ascii="Consolas" w:hAnsi="Consolas" w:cs="Times New Roman"/>
-          <w:color w:val="000000"/>
-          <w:sz w:val="19"/>
-        </w:rPr>
-      </w:pPr>
+        <w:t>7.2. Thuật toán điều tiết băng thông thông minh (Adaptive Rate Limiting)</w:t>
+      </w:r>
+    </w:p>
+    <w:p>
+      <w:pPr>
+        <w:rPr>
+          <w:rFonts w:ascii="Times New Roman" w:hAnsi="Times New Roman" w:cs="Times New Roman"/>
+          <w:color w:val="000000"/>
+          <w:sz w:val="22"/>
+        </w:rPr>
+      </w:pPr>
+      <w:r>
+        <w:rPr>
+          <w:rFonts w:ascii="Times New Roman" w:hAnsi="Times New Roman" w:cs="Times New Roman"/>
+          <w:color w:val="000000"/>
+          <w:sz w:val="22"/>
+        </w:rPr>
+        <w:t>Trong src/main.cpp, tác vụ ble_task không phát sóng mù quáng 10 lần/giây mà áp dụng bộ lọc sự kiện:</w:t>
+      </w:r>
+    </w:p>
+    <w:p>
+      <w:pPr>
+        <w:rPr>
+          <w:rFonts w:ascii="Consolas" w:hAnsi="Consolas" w:cs="Times New Roman"/>
+          <w:color w:val="000000"/>
+          <w:sz w:val="19"/>
+        </w:rPr>
+      </w:pPr>
+      <w:r>
+        <w:rPr>
+          <w:rFonts w:ascii="Consolas" w:hAnsi="Consolas" w:cs="Times New Roman"/>
+          <w:color w:val="000000"/>
+          <w:sz w:val="19"/>
+        </w:rPr>
+        <w:t>bool level_changed = event.urgency_level != last_level;</w:t>
+      </w:r>
+    </w:p>
+    <w:p>
+      <w:pPr>
+        <w:rPr>
+          <w:rFonts w:ascii="Consolas" w:hAnsi="Consolas" w:cs="Times New Roman"/>
+          <w:color w:val="000000"/>
+          <w:sz w:val="19"/>
+        </w:rPr>
+      </w:pPr>
+      <w:r>
+        <w:rPr>
+          <w:rFonts w:ascii="Consolas" w:hAnsi="Consolas" w:cs="Times New Roman"/>
+          <w:color w:val="000000"/>
+          <w:sz w:val="19"/>
+        </w:rPr>
+        <w:t>bool moved         = abs((int)event.distance_mm - (int)last_mm) &gt; 100; // Thay đổi &gt; 10cm</w:t>
+      </w:r>
+    </w:p>
+    <w:p>
+      <w:pPr>
+        <w:rPr>
+          <w:rFonts w:ascii="Consolas" w:hAnsi="Consolas" w:cs="Times New Roman"/>
+          <w:color w:val="000000"/>
+          <w:sz w:val="19"/>
+        </w:rPr>
+      </w:pPr>
+      <w:r>
+        <w:rPr>
+          <w:rFonts w:ascii="Consolas" w:hAnsi="Consolas" w:cs="Times New Roman"/>
+          <w:color w:val="000000"/>
+          <w:sz w:val="19"/>
+        </w:rPr>
+        <w:t>bool heartbeat     = event.timestamp_ms - last_sent &gt;= 1000;          // Nhịp tim 1s</w:t>
+      </w:r>
+    </w:p>
+    <w:p>
+      <w:pPr>
+        <w:rPr>
+          <w:rFonts w:ascii="Consolas" w:hAnsi="Consolas" w:cs="Times New Roman"/>
+          <w:color w:val="000000"/>
+          <w:sz w:val="19"/>
+        </w:rPr>
+      </w:pPr>
+    </w:p>
+    <w:p>
+      <w:pPr>
+        <w:rPr>
+          <w:rFonts w:ascii="Consolas" w:hAnsi="Consolas" w:cs="Times New Roman"/>
+          <w:color w:val="000000"/>
+          <w:sz w:val="19"/>
+        </w:rPr>
+      </w:pPr>
+      <w:r>
+        <w:rPr>
+          <w:rFonts w:ascii="Consolas" w:hAnsi="Consolas" w:cs="Times New Roman"/>
+          <w:color w:val="000000"/>
+          <w:sz w:val="19"/>
+        </w:rPr>
+        <w:t>if (level_changed || moved || heartbeat) {</w:t>
+      </w:r>
+    </w:p>
+    <w:p>
+      <w:pPr>
+        <w:rPr>
+          <w:rFonts w:ascii="Consolas" w:hAnsi="Consolas" w:cs="Times New Roman"/>
+          <w:color w:val="000000"/>
+          <w:sz w:val="19"/>
+        </w:rPr>
+      </w:pPr>
+      <w:r>
+        <w:rPr>
+          <w:rFonts w:ascii="Consolas" w:hAnsi="Consolas" w:cs="Times New Roman"/>
+          <w:color w:val="000000"/>
+          <w:sz w:val="19"/>
+        </w:rPr>
+        <w:t xml:space="preserve">  ble_notify(event);</w:t>
+      </w:r>
+    </w:p>
+    <w:p>
+      <w:pPr>
+        <w:rPr>
+          <w:rFonts w:ascii="Consolas" w:hAnsi="Consolas" w:cs="Times New Roman"/>
+          <w:color w:val="000000"/>
+          <w:sz w:val="19"/>
+        </w:rPr>
+      </w:pPr>
+      <w:r>
+        <w:rPr>
+          <w:rFonts w:ascii="Consolas" w:hAnsi="Consolas" w:cs="Times New Roman"/>
+          <w:color w:val="000000"/>
+          <w:sz w:val="19"/>
+        </w:rPr>
+        <w:t xml:space="preserve">  last_level = event.urgency_level;</w:t>
+      </w:r>
+    </w:p>
+    <w:p>
+      <w:pPr>
+        <w:rPr>
+          <w:rFonts w:ascii="Consolas" w:hAnsi="Consolas" w:cs="Times New Roman"/>
+          <w:color w:val="000000"/>
+          <w:sz w:val="19"/>
+        </w:rPr>
+      </w:pPr>
+      <w:r>
+        <w:rPr>
+          <w:rFonts w:ascii="Consolas" w:hAnsi="Consolas" w:cs="Times New Roman"/>
+          <w:color w:val="000000"/>
+          <w:sz w:val="19"/>
+        </w:rPr>
+        <w:t xml:space="preserve">  last_mm    = event.distance_mm;</w:t>
+      </w:r>
+    </w:p>
+    <w:p>
+      <w:pPr>
+        <w:rPr>
+          <w:rFonts w:ascii="Consolas" w:hAnsi="Consolas" w:cs="Times New Roman"/>
+          <w:color w:val="000000"/>
+          <w:sz w:val="19"/>
+        </w:rPr>
+      </w:pPr>
+      <w:r>
+        <w:rPr>
+          <w:rFonts w:ascii="Consolas" w:hAnsi="Consolas" w:cs="Times New Roman"/>
+          <w:color w:val="000000"/>
+          <w:sz w:val="19"/>
+        </w:rPr>
+        <w:t xml:space="preserve">  last_sent  = event.timestamp_ms;</w:t>
+      </w:r>
+    </w:p>
+    <w:p>
+      <w:pPr>
+        <w:rPr>
+          <w:rFonts w:ascii="Consolas" w:hAnsi="Consolas" w:cs="Times New Roman"/>
+          <w:color w:val="000000"/>
+          <w:sz w:val="19"/>
+        </w:rPr>
+      </w:pPr>
+      <w:r>
+        <w:rPr>
+          <w:rFonts w:ascii="Consolas" w:hAnsi="Consolas" w:cs="Times New Roman"/>
+          <w:color w:val="000000"/>
+          <w:sz w:val="19"/>
+        </w:rPr>
+        <w:t>}</w:t>
+      </w:r>
+    </w:p>
+    <w:p>
+      <w:pPr>
+        <w:rPr>
+          <w:rFonts w:ascii="Consolas" w:hAnsi="Consolas" w:cs="Times New Roman"/>
+          <w:color w:val="000000"/>
+          <w:sz w:val="19"/>
+        </w:rPr>
+      </w:pPr>
+    </w:p>
+    <w:p>
+      <w:pPr>
+        <w:rPr>
+          <w:rFonts w:ascii="Times New Roman" w:hAnsi="Times New Roman" w:cs="Times New Roman"/>
+          <w:color w:val="000000"/>
+          <w:sz w:val="22"/>
+        </w:rPr>
+      </w:pPr>
+      <w:r>
+        <w:rPr>
+          <w:rFonts w:ascii="Times New Roman" w:hAnsi="Times New Roman" w:cs="Times New Roman"/>
+          <w:color w:val="000000"/>
+          <w:sz w:val="22"/>
+        </w:rPr>
+        <w:t>Lợi ích: Tiết kiệm năng lượng tối đa cho viên pin LiPo của hệ thống kính thông minh và giảm tải tắc nghẽn vô tuyến.</w:t>
+      </w:r>
     </w:p>
     <w:p>
       <w:pPr>
@@ -4250,7 +4823,7 @@
           <w:color w:val="000000"/>
           <w:sz w:val="22"/>
         </w:rPr>
-        <w:t>Trong quá trình xây dựng firmware và mô phỏng trên Wokwi, nhóm phát triển đã phân tích và giải quyết triệt để 4 vấn đề kỹ thuật chuyên sâu:</w:t>
+        <w:t>Trong quá trình xây dựng firmware và mô phỏng trên Wokwi, nhóm phát triển đã phân tích và giải quyết triệt để 5 vấn đề kỹ thuật chuyên sâu:</w:t>
       </w:r>
     </w:p>
     <w:p>
@@ -4481,7 +5054,7 @@
           <w:color w:val="000000"/>
           <w:sz w:val="22"/>
         </w:rPr>
-        <w:t>- Giải pháp: Bổ sung cơ chế bảo vệ an toàn (Fail-Safe):</w:t>
+        <w:t>- Giải pháp: Bổ sung cơ chế bảo vệ an toàn (Fail-Safe) trong src/sensor_tof.cpp:</w:t>
       </w:r>
     </w:p>
     <w:p>
@@ -4515,7 +5088,7 @@
           <w:color w:val="000000"/>
           <w:sz w:val="22"/>
         </w:rPr>
-        <w:t xml:space="preserve">  if (distance_cm &lt;= 0.0f || distance_cm &gt; THRESHOLD_CHU_Y_CM) return 0;</w:t>
+        <w:t xml:space="preserve">  if (d &lt;= 0.0f || d &gt; THRESHOLD_CHU_Y_CM) raw = 0;</w:t>
       </w:r>
     </w:p>
     <w:p>
@@ -4609,26 +5182,8 @@
           <w:color w:val="000000"/>
           <w:sz w:val="22"/>
         </w:rPr>
-        <w:t>- Giải pháp: Hiện thực hóa cơ chế quản lý trạng thái động: Gọi ledcDetachPin() để giải phóng chân về chế độ GPIO thường rồi kéo mức LOW tuyệt đối khi về Level 0; chỉ gọi ledcAttachPin() trở lại khi có cảnh báo xuất hiện.</w:t>
-      </w:r>
-    </w:p>
-    <w:p>
-      <w:pPr>
-        <w:rPr>
-          <w:rFonts w:ascii="Times New Roman" w:hAnsi="Times New Roman" w:cs="Times New Roman"/>
-          <w:color w:val="000000"/>
-          <w:sz w:val="22"/>
-        </w:rPr>
-      </w:pPr>
-    </w:p>
-    <w:p>
-      <w:pPr>
-        <w:rPr>
-          <w:rFonts w:ascii="Times New Roman" w:hAnsi="Times New Roman" w:cs="Times New Roman"/>
-          <w:color w:val="000000"/>
-          <w:sz w:val="22"/>
-        </w:rPr>
-      </w:pPr>
+        <w:t>- Giải pháp: Hiện thực hóa cơ chế quản lý trạng thái động trong src/feedback_motor.cpp: Gọi ledcDetachPin() để giải phóng chân về chế độ GPIO thường rồi kéo mức LOW tuyệt đối khi về Level 0; chỉ gọi ledcAttachPin() trở lại khi có cảnh báo xuất hiện.</w:t>
+      </w:r>
     </w:p>
     <w:p>
       <w:pPr>
@@ -4645,6 +5200,152 @@
           <w:rFonts w:ascii="Times New Roman" w:hAnsi="Times New Roman" w:cs="Times New Roman"/>
           <w:b/>
           <w:color w:val="000000"/>
+        </w:rPr>
+      </w:pPr>
+      <w:r>
+        <w:rPr>
+          <w:rFonts w:ascii="Times New Roman" w:hAnsi="Times New Roman" w:cs="Times New Roman"/>
+          <w:b/>
+          <w:color w:val="000000"/>
+        </w:rPr>
+        <w:t>Sự cố 5: Lệch dòng (Thụt bậc thang) trên Serial Monitor</w:t>
+      </w:r>
+    </w:p>
+    <w:p>
+      <w:pPr>
+        <w:rPr>
+          <w:rFonts w:ascii="Times New Roman" w:hAnsi="Times New Roman" w:cs="Times New Roman"/>
+          <w:color w:val="000000"/>
+          <w:sz w:val="22"/>
+        </w:rPr>
+      </w:pPr>
+      <w:r>
+        <w:rPr>
+          <w:rFonts w:ascii="Times New Roman" w:hAnsi="Times New Roman" w:cs="Times New Roman"/>
+          <w:color w:val="000000"/>
+          <w:sz w:val="22"/>
+        </w:rPr>
+        <w:t>- Hiện tượng: Dòng chữ in ra bị lệch chéo bậc thang trên terminal.</w:t>
+      </w:r>
+    </w:p>
+    <w:p>
+      <w:pPr>
+        <w:rPr>
+          <w:rFonts w:ascii="Times New Roman" w:hAnsi="Times New Roman" w:cs="Times New Roman"/>
+          <w:color w:val="000000"/>
+          <w:sz w:val="22"/>
+        </w:rPr>
+      </w:pPr>
+      <w:r>
+        <w:rPr>
+          <w:rFonts w:ascii="Times New Roman" w:hAnsi="Times New Roman" w:cs="Times New Roman"/>
+          <w:color w:val="000000"/>
+          <w:sz w:val="22"/>
+        </w:rPr>
+        <w:t>- Nguyên nhân: Chuỗi in dùng \n thiếu ký tự về đầu dòng \r (Carriage Return).</w:t>
+      </w:r>
+    </w:p>
+    <w:p>
+      <w:pPr>
+        <w:rPr>
+          <w:rFonts w:ascii="Times New Roman" w:hAnsi="Times New Roman" w:cs="Times New Roman"/>
+          <w:color w:val="000000"/>
+          <w:sz w:val="22"/>
+        </w:rPr>
+      </w:pPr>
+      <w:r>
+        <w:rPr>
+          <w:rFonts w:ascii="Times New Roman" w:hAnsi="Times New Roman" w:cs="Times New Roman"/>
+          <w:color w:val="000000"/>
+          <w:sz w:val="22"/>
+        </w:rPr>
+        <w:t>- Giải pháp: Chuẩn hóa format chuỗi in trong src/main.cpp thành:</w:t>
+      </w:r>
+    </w:p>
+    <w:p>
+      <w:pPr>
+        <w:rPr>
+          <w:rFonts w:ascii="Times New Roman" w:hAnsi="Times New Roman" w:cs="Times New Roman"/>
+          <w:color w:val="000000"/>
+          <w:sz w:val="22"/>
+        </w:rPr>
+      </w:pPr>
+      <w:r>
+        <w:rPr>
+          <w:rFonts w:ascii="Times New Roman" w:hAnsi="Times New Roman" w:cs="Times New Roman"/>
+          <w:color w:val="000000"/>
+          <w:sz w:val="22"/>
+        </w:rPr>
+        <w:t xml:space="preserve">  ```cpp</w:t>
+      </w:r>
+    </w:p>
+    <w:p>
+      <w:pPr>
+        <w:rPr>
+          <w:rFonts w:ascii="Times New Roman" w:hAnsi="Times New Roman" w:cs="Times New Roman"/>
+          <w:color w:val="000000"/>
+          <w:sz w:val="22"/>
+        </w:rPr>
+      </w:pPr>
+      <w:r>
+        <w:rPr>
+          <w:rFonts w:ascii="Times New Roman" w:hAnsi="Times New Roman" w:cs="Times New Roman"/>
+          <w:color w:val="000000"/>
+          <w:sz w:val="22"/>
+        </w:rPr>
+        <w:t xml:space="preserve">  Serial.printf("Khoang cach: %.1f cm | Urgency: %d\r\n", ...);</w:t>
+      </w:r>
+    </w:p>
+    <w:p>
+      <w:pPr>
+        <w:rPr>
+          <w:rFonts w:ascii="Times New Roman" w:hAnsi="Times New Roman" w:cs="Times New Roman"/>
+          <w:color w:val="000000"/>
+          <w:sz w:val="22"/>
+        </w:rPr>
+      </w:pPr>
+      <w:r>
+        <w:rPr>
+          <w:rFonts w:ascii="Times New Roman" w:hAnsi="Times New Roman" w:cs="Times New Roman"/>
+          <w:color w:val="000000"/>
+          <w:sz w:val="22"/>
+        </w:rPr>
+        <w:t xml:space="preserve">  ```</w:t>
+      </w:r>
+    </w:p>
+    <w:p>
+      <w:pPr>
+        <w:rPr>
+          <w:rFonts w:ascii="Times New Roman" w:hAnsi="Times New Roman" w:cs="Times New Roman"/>
+          <w:color w:val="000000"/>
+          <w:sz w:val="22"/>
+        </w:rPr>
+      </w:pPr>
+    </w:p>
+    <w:p>
+      <w:pPr>
+        <w:rPr>
+          <w:rFonts w:ascii="Times New Roman" w:hAnsi="Times New Roman" w:cs="Times New Roman"/>
+          <w:color w:val="000000"/>
+          <w:sz w:val="22"/>
+        </w:rPr>
+      </w:pPr>
+    </w:p>
+    <w:p>
+      <w:pPr>
+        <w:rPr>
+          <w:rFonts w:ascii="Times New Roman" w:hAnsi="Times New Roman" w:cs="Times New Roman"/>
+          <w:color w:val="000000"/>
+          <w:sz w:val="22"/>
+        </w:rPr>
+      </w:pPr>
+    </w:p>
+    <w:p>
+      <w:pPr>
+        <w:rPr>
+          <w:rFonts w:ascii="Times New Roman" w:hAnsi="Times New Roman" w:cs="Times New Roman"/>
+          <w:b/>
+          <w:color w:val="000000"/>
           <w:sz w:val="28"/>
         </w:rPr>
       </w:pPr>
@@ -4715,6 +5416,40 @@
           <w:color w:val="000000"/>
           <w:sz w:val="22"/>
         </w:rPr>
+        <w:t>- Tích hợp thành công Bộ lọc cửa sổ trượt 5 mẫu và Cơ chế trễ Hysteresis 10cm, đảm bảo hoạt động êm ái, chống rung giật.</w:t>
+      </w:r>
+    </w:p>
+    <w:p>
+      <w:pPr>
+        <w:rPr>
+          <w:rFonts w:ascii="Times New Roman" w:hAnsi="Times New Roman" w:cs="Times New Roman"/>
+          <w:color w:val="000000"/>
+          <w:sz w:val="22"/>
+        </w:rPr>
+      </w:pPr>
+      <w:r>
+        <w:rPr>
+          <w:rFonts w:ascii="Times New Roman" w:hAnsi="Times New Roman" w:cs="Times New Roman"/>
+          <w:color w:val="000000"/>
+          <w:sz w:val="22"/>
+        </w:rPr>
+        <w:t>- Tối ưu hóa truyền thông không dây BLE với Adaptive Rate Limiting.</w:t>
+      </w:r>
+    </w:p>
+    <w:p>
+      <w:pPr>
+        <w:rPr>
+          <w:rFonts w:ascii="Times New Roman" w:hAnsi="Times New Roman" w:cs="Times New Roman"/>
+          <w:color w:val="000000"/>
+          <w:sz w:val="22"/>
+        </w:rPr>
+      </w:pPr>
+      <w:r>
+        <w:rPr>
+          <w:rFonts w:ascii="Times New Roman" w:hAnsi="Times New Roman" w:cs="Times New Roman"/>
+          <w:color w:val="000000"/>
+          <w:sz w:val="22"/>
+        </w:rPr>
         <w:t>- Mã nguồn được mô-đun hóa sạch sẽ, đạt chuẩn kiểm thử và biên dịch thành công 100% trên PlatformIO.</w:t>
       </w:r>
     </w:p>
@@ -4726,23 +5461,6 @@
           <w:sz w:val="22"/>
         </w:rPr>
       </w:pPr>
-      <w:r>
-        <w:rPr>
-          <w:rFonts w:ascii="Times New Roman" w:hAnsi="Times New Roman" w:cs="Times New Roman"/>
-          <w:color w:val="000000"/>
-          <w:sz w:val="22"/>
-        </w:rPr>
-        <w:t>- Đã kiểm chứng thành công trên Wokwi toàn bộ chu trình: Đo khoảng cách $\rightarrow$ Lọc dữ liệu $\rightarrow$ Phân cấp cảnh báo $\rightarrow$ Điều chế xung Haptic $\rightarrow$ Phát sóng BLE.</w:t>
-      </w:r>
-    </w:p>
-    <w:p>
-      <w:pPr>
-        <w:rPr>
-          <w:rFonts w:ascii="Times New Roman" w:hAnsi="Times New Roman" w:cs="Times New Roman"/>
-          <w:color w:val="000000"/>
-          <w:sz w:val="22"/>
-        </w:rPr>
-      </w:pPr>
     </w:p>
     <w:p>
       <w:pPr>
@@ -4809,58 +5527,24 @@
           <w:color w:val="000000"/>
           <w:sz w:val="22"/>
         </w:rPr>
-        <w:t xml:space="preserve">   - Thay thế ruột hàm read_distance_cm() trong sensor_tof.cpp bằng driver Pololu VL53L1X.h (toàn bộ logic FreeRTOS, BLE và Motor giữ nguyên).</w:t>
-      </w:r>
-    </w:p>
-    <w:p>
-      <w:pPr>
-        <w:rPr>
-          <w:rFonts w:ascii="Times New Roman" w:hAnsi="Times New Roman" w:cs="Times New Roman"/>
-          <w:color w:val="000000"/>
-          <w:sz w:val="22"/>
-        </w:rPr>
-      </w:pPr>
-      <w:r>
-        <w:rPr>
-          <w:rFonts w:ascii="Times New Roman" w:hAnsi="Times New Roman" w:cs="Times New Roman"/>
-          <w:color w:val="000000"/>
-          <w:sz w:val="22"/>
-        </w:rPr>
-        <w:t>2. Hiện thực hóa bộ lọc số:</w:t>
-      </w:r>
-    </w:p>
-    <w:p>
-      <w:pPr>
-        <w:rPr>
-          <w:rFonts w:ascii="Times New Roman" w:hAnsi="Times New Roman" w:cs="Times New Roman"/>
-          <w:color w:val="000000"/>
-          <w:sz w:val="22"/>
-        </w:rPr>
-      </w:pPr>
-      <w:r>
-        <w:rPr>
-          <w:rFonts w:ascii="Times New Roman" w:hAnsi="Times New Roman" w:cs="Times New Roman"/>
-          <w:color w:val="000000"/>
-          <w:sz w:val="22"/>
-        </w:rPr>
-        <w:t xml:space="preserve">   - Nhúng thuật toán lọc trung vị (Median Filter) 5 mẫu và dải trễ Hysteresis 10cm vào sensor_tof.cpp.</w:t>
-      </w:r>
-    </w:p>
-    <w:p>
-      <w:pPr>
-        <w:rPr>
-          <w:rFonts w:ascii="Times New Roman" w:hAnsi="Times New Roman" w:cs="Times New Roman"/>
-          <w:color w:val="000000"/>
-          <w:sz w:val="22"/>
-        </w:rPr>
-      </w:pPr>
-      <w:r>
-        <w:rPr>
-          <w:rFonts w:ascii="Times New Roman" w:hAnsi="Times New Roman" w:cs="Times New Roman"/>
-          <w:color w:val="000000"/>
-          <w:sz w:val="22"/>
-        </w:rPr>
-        <w:t>3. Kiểm thử thực địa (Field Testing):</w:t>
+        <w:t xml:space="preserve">   - Thay thế ruột hàm read_distance_cm() trong sensor_tof.cpp bằng driver Pololu VL53L1X.h (toàn bộ logic FreeRTOS, BLE và Haptic Motor giữ nguyên 100%).</w:t>
+      </w:r>
+    </w:p>
+    <w:p>
+      <w:pPr>
+        <w:rPr>
+          <w:rFonts w:ascii="Times New Roman" w:hAnsi="Times New Roman" w:cs="Times New Roman"/>
+          <w:color w:val="000000"/>
+          <w:sz w:val="22"/>
+        </w:rPr>
+      </w:pPr>
+      <w:r>
+        <w:rPr>
+          <w:rFonts w:ascii="Times New Roman" w:hAnsi="Times New Roman" w:cs="Times New Roman"/>
+          <w:color w:val="000000"/>
+          <w:sz w:val="22"/>
+        </w:rPr>
+        <w:t>2. Kiểm thử thực địa (Field Testing):</w:t>
       </w:r>
     </w:p>
     <w:p>
@@ -5307,7 +5991,7 @@
     <w:link w:val="u1Char"/>
     <w:uiPriority w:val="9"/>
     <w:qFormat/>
-    <w:rsid w:val="004A5667"/>
+    <w:rsid w:val="007D75C1"/>
     <w:pPr>
       <w:keepNext/>
       <w:keepLines/>
@@ -5330,7 +6014,7 @@
     <w:semiHidden/>
     <w:unhideWhenUsed/>
     <w:qFormat/>
-    <w:rsid w:val="004A5667"/>
+    <w:rsid w:val="007D75C1"/>
     <w:pPr>
       <w:keepNext/>
       <w:keepLines/>
@@ -5353,7 +6037,7 @@
     <w:semiHidden/>
     <w:unhideWhenUsed/>
     <w:qFormat/>
-    <w:rsid w:val="004A5667"/>
+    <w:rsid w:val="007D75C1"/>
     <w:pPr>
       <w:keepNext/>
       <w:keepLines/>
@@ -5376,7 +6060,7 @@
     <w:semiHidden/>
     <w:unhideWhenUsed/>
     <w:qFormat/>
-    <w:rsid w:val="004A5667"/>
+    <w:rsid w:val="007D75C1"/>
     <w:pPr>
       <w:keepNext/>
       <w:keepLines/>
@@ -5399,7 +6083,7 @@
     <w:semiHidden/>
     <w:unhideWhenUsed/>
     <w:qFormat/>
-    <w:rsid w:val="004A5667"/>
+    <w:rsid w:val="007D75C1"/>
     <w:pPr>
       <w:keepNext/>
       <w:keepLines/>
@@ -5420,7 +6104,7 @@
     <w:semiHidden/>
     <w:unhideWhenUsed/>
     <w:qFormat/>
-    <w:rsid w:val="004A5667"/>
+    <w:rsid w:val="007D75C1"/>
     <w:pPr>
       <w:keepNext/>
       <w:keepLines/>
@@ -5443,7 +6127,7 @@
     <w:semiHidden/>
     <w:unhideWhenUsed/>
     <w:qFormat/>
-    <w:rsid w:val="004A5667"/>
+    <w:rsid w:val="007D75C1"/>
     <w:pPr>
       <w:keepNext/>
       <w:keepLines/>
@@ -5464,7 +6148,7 @@
     <w:semiHidden/>
     <w:unhideWhenUsed/>
     <w:qFormat/>
-    <w:rsid w:val="004A5667"/>
+    <w:rsid w:val="007D75C1"/>
     <w:pPr>
       <w:keepNext/>
       <w:keepLines/>
@@ -5487,7 +6171,7 @@
     <w:semiHidden/>
     <w:unhideWhenUsed/>
     <w:qFormat/>
-    <w:rsid w:val="004A5667"/>
+    <w:rsid w:val="007D75C1"/>
     <w:pPr>
       <w:keepNext/>
       <w:keepLines/>
@@ -5531,7 +6215,7 @@
     <w:basedOn w:val="Phngmcinhcuaoanvn"/>
     <w:link w:val="u1"/>
     <w:uiPriority w:val="9"/>
-    <w:rsid w:val="004A5667"/>
+    <w:rsid w:val="007D75C1"/>
     <w:rPr>
       <w:rFonts w:asciiTheme="majorHAnsi" w:eastAsiaTheme="majorEastAsia" w:hAnsiTheme="majorHAnsi" w:cstheme="majorBidi"/>
       <w:color w:val="2E74B5" w:themeColor="accent1" w:themeShade="BF"/>
@@ -5545,7 +6229,7 @@
     <w:link w:val="u2"/>
     <w:uiPriority w:val="9"/>
     <w:semiHidden/>
-    <w:rsid w:val="004A5667"/>
+    <w:rsid w:val="007D75C1"/>
     <w:rPr>
       <w:rFonts w:asciiTheme="majorHAnsi" w:eastAsiaTheme="majorEastAsia" w:hAnsiTheme="majorHAnsi" w:cstheme="majorBidi"/>
       <w:color w:val="2E74B5" w:themeColor="accent1" w:themeShade="BF"/>
@@ -5559,7 +6243,7 @@
     <w:link w:val="u3"/>
     <w:uiPriority w:val="9"/>
     <w:semiHidden/>
-    <w:rsid w:val="004A5667"/>
+    <w:rsid w:val="007D75C1"/>
     <w:rPr>
       <w:rFonts w:eastAsiaTheme="majorEastAsia" w:cstheme="majorBidi"/>
       <w:color w:val="2E74B5" w:themeColor="accent1" w:themeShade="BF"/>
@@ -5573,7 +6257,7 @@
     <w:link w:val="u4"/>
     <w:uiPriority w:val="9"/>
     <w:semiHidden/>
-    <w:rsid w:val="004A5667"/>
+    <w:rsid w:val="007D75C1"/>
     <w:rPr>
       <w:rFonts w:eastAsiaTheme="majorEastAsia" w:cstheme="majorBidi"/>
       <w:i/>
@@ -5587,7 +6271,7 @@
     <w:link w:val="u5"/>
     <w:uiPriority w:val="9"/>
     <w:semiHidden/>
-    <w:rsid w:val="004A5667"/>
+    <w:rsid w:val="007D75C1"/>
     <w:rPr>
       <w:rFonts w:eastAsiaTheme="majorEastAsia" w:cstheme="majorBidi"/>
       <w:color w:val="2E74B5" w:themeColor="accent1" w:themeShade="BF"/>
@@ -5599,7 +6283,7 @@
     <w:link w:val="u6"/>
     <w:uiPriority w:val="9"/>
     <w:semiHidden/>
-    <w:rsid w:val="004A5667"/>
+    <w:rsid w:val="007D75C1"/>
     <w:rPr>
       <w:rFonts w:eastAsiaTheme="majorEastAsia" w:cstheme="majorBidi"/>
       <w:i/>
@@ -5613,7 +6297,7 @@
     <w:link w:val="u7"/>
     <w:uiPriority w:val="9"/>
     <w:semiHidden/>
-    <w:rsid w:val="004A5667"/>
+    <w:rsid w:val="007D75C1"/>
     <w:rPr>
       <w:rFonts w:eastAsiaTheme="majorEastAsia" w:cstheme="majorBidi"/>
       <w:color w:val="595959" w:themeColor="text1" w:themeTint="A6"/>
@@ -5625,7 +6309,7 @@
     <w:link w:val="u8"/>
     <w:uiPriority w:val="9"/>
     <w:semiHidden/>
-    <w:rsid w:val="004A5667"/>
+    <w:rsid w:val="007D75C1"/>
     <w:rPr>
       <w:rFonts w:eastAsiaTheme="majorEastAsia" w:cstheme="majorBidi"/>
       <w:i/>
@@ -5639,7 +6323,7 @@
     <w:link w:val="u9"/>
     <w:uiPriority w:val="9"/>
     <w:semiHidden/>
-    <w:rsid w:val="004A5667"/>
+    <w:rsid w:val="007D75C1"/>
     <w:rPr>
       <w:rFonts w:eastAsiaTheme="majorEastAsia" w:cstheme="majorBidi"/>
       <w:color w:val="272727" w:themeColor="text1" w:themeTint="D8"/>
@@ -5652,7 +6336,7 @@
     <w:link w:val="TiuChar"/>
     <w:uiPriority w:val="10"/>
     <w:qFormat/>
-    <w:rsid w:val="004A5667"/>
+    <w:rsid w:val="007D75C1"/>
     <w:pPr>
       <w:spacing w:after="80" w:line="240" w:lineRule="auto"/>
       <w:contextualSpacing/>
@@ -5670,7 +6354,7 @@
     <w:basedOn w:val="Phngmcinhcuaoanvn"/>
     <w:link w:val="Tiu"/>
     <w:uiPriority w:val="10"/>
-    <w:rsid w:val="004A5667"/>
+    <w:rsid w:val="007D75C1"/>
     <w:rPr>
       <w:rFonts w:asciiTheme="majorHAnsi" w:eastAsiaTheme="majorEastAsia" w:hAnsiTheme="majorHAnsi" w:cstheme="majorBidi"/>
       <w:spacing w:val="-10"/>
@@ -5686,7 +6370,7 @@
     <w:link w:val="TiuphuChar"/>
     <w:uiPriority w:val="11"/>
     <w:qFormat/>
-    <w:rsid w:val="004A5667"/>
+    <w:rsid w:val="007D75C1"/>
     <w:pPr>
       <w:numPr>
         <w:ilvl w:val="1"/>
@@ -5705,7 +6389,7 @@
     <w:basedOn w:val="Phngmcinhcuaoanvn"/>
     <w:link w:val="Tiuphu"/>
     <w:uiPriority w:val="11"/>
-    <w:rsid w:val="004A5667"/>
+    <w:rsid w:val="007D75C1"/>
     <w:rPr>
       <w:rFonts w:eastAsiaTheme="majorEastAsia" w:cstheme="majorBidi"/>
       <w:color w:val="595959" w:themeColor="text1" w:themeTint="A6"/>
@@ -5721,7 +6405,7 @@
     <w:link w:val="LitrichdnChar"/>
     <w:uiPriority w:val="29"/>
     <w:qFormat/>
-    <w:rsid w:val="004A5667"/>
+    <w:rsid w:val="007D75C1"/>
     <w:pPr>
       <w:spacing w:before="160"/>
       <w:jc w:val="center"/>
@@ -5737,7 +6421,7 @@
     <w:basedOn w:val="Phngmcinhcuaoanvn"/>
     <w:link w:val="Litrichdn"/>
     <w:uiPriority w:val="29"/>
-    <w:rsid w:val="004A5667"/>
+    <w:rsid w:val="007D75C1"/>
     <w:rPr>
       <w:i/>
       <w:iCs/>
@@ -5749,7 +6433,7 @@
     <w:basedOn w:val="Binhthng"/>
     <w:uiPriority w:val="34"/>
     <w:qFormat/>
-    <w:rsid w:val="004A5667"/>
+    <w:rsid w:val="007D75C1"/>
     <w:pPr>
       <w:ind w:left="720"/>
       <w:contextualSpacing/>
@@ -5760,7 +6444,7 @@
     <w:basedOn w:val="Phngmcinhcuaoanvn"/>
     <w:uiPriority w:val="21"/>
     <w:qFormat/>
-    <w:rsid w:val="004A5667"/>
+    <w:rsid w:val="007D75C1"/>
     <w:rPr>
       <w:i/>
       <w:iCs/>
@@ -5774,7 +6458,7 @@
     <w:link w:val="NhaykepmChar"/>
     <w:uiPriority w:val="30"/>
     <w:qFormat/>
-    <w:rsid w:val="004A5667"/>
+    <w:rsid w:val="007D75C1"/>
     <w:pPr>
       <w:pBdr>
         <w:top w:val="single" w:sz="4" w:space="10" w:color="2E74B5" w:themeColor="accent1" w:themeShade="BF"/>
@@ -5795,7 +6479,7 @@
     <w:basedOn w:val="Phngmcinhcuaoanvn"/>
     <w:link w:val="Nhaykepm"/>
     <w:uiPriority w:val="30"/>
-    <w:rsid w:val="004A5667"/>
+    <w:rsid w:val="007D75C1"/>
     <w:rPr>
       <w:i/>
       <w:iCs/>
@@ -5807,7 +6491,7 @@
     <w:basedOn w:val="Phngmcinhcuaoanvn"/>
     <w:uiPriority w:val="32"/>
     <w:qFormat/>
-    <w:rsid w:val="004A5667"/>
+    <w:rsid w:val="007D75C1"/>
     <w:rPr>
       <w:b/>
       <w:bCs/>

</xml_diff>